<commit_message>
Add rendered architecture diagram and wire screenshot figure refs
- thesis/figures/architecture.dot + .png: 5-layer graphviz architecture
  matching the real app/ package structure (UI, pipeline, classroom,
  signals, report) with external Classroom/Drive and SQLite cylinders.
- thesis/diploma.md: Fig 2.1 now points at figures/architecture.png.
- Figs 5.1-5.5 wired to figures/task{1,2,3}.png and
  figures/submission-{ai-pasted,cohort}.png. Save the dashboard
  screenshots and HTML drill-downs at those exact paths and re-run
  pandoc to embed them in the DOCX.
- Reference count adjusted to 6 illustrations in the referat.
</commit_message>
<xml_diff>
--- a/thesis/diploma.docx
+++ b/thesis/diploma.docx
@@ -246,7 +246,7 @@
         <w:pStyle w:val="FirstParagraph"/>
       </w:pPr>
       <w:r>
-        <w:t xml:space="preserve">Обсяг роботи — 56 сторінок, 9 ілюстрацій, 8 таблиць, 27 джерел посилань, 3 додатки.</w:t>
+        <w:t xml:space="preserve">Обсяг роботи — 56 сторінок, 6 ілюстрацій, 8 таблиць, 27 джерел посилань, 3 додатки.</w:t>
       </w:r>
     </w:p>
     <w:p>
@@ -1500,7 +1500,7 @@
     </w:p>
     <w:bookmarkEnd w:id="33"/>
     <w:bookmarkEnd w:id="34"/>
-    <w:bookmarkStart w:id="39" w:name="архітектура-запропонованого-засобу"/>
+    <w:bookmarkStart w:id="42" w:name="архітектура-запропонованого-засобу"/>
     <w:p>
       <w:pPr>
         <w:pStyle w:val="Heading1"/>
@@ -1509,7 +1509,7 @@
         <w:t xml:space="preserve">2 АРХІТЕКТУРА ЗАПРОПОНОВАНОГО ЗАСОБУ</w:t>
       </w:r>
     </w:p>
-    <w:bookmarkStart w:id="35" w:name="загальна-структура-інструменту"/>
+    <w:bookmarkStart w:id="38" w:name="загальна-структура-інструменту"/>
     <w:p>
       <w:pPr>
         <w:pStyle w:val="Heading2"/>
@@ -1702,31 +1702,53 @@
         <w:t xml:space="preserve">з полями: ідентифікатор правила або каналу, посилання на сабмішн і спан тексту, об’єкт-підтвердження (наприклад, вирівняні фрагменти з іншого сабмішну або фразу-преамбулу), числове значення впевненості. Цей контракт дозволяє розширювати інструмент новими сигналами без модифікації ранкера й інтерфейсу.</w:t>
       </w:r>
     </w:p>
-    <w:tbl>
-      <w:tblPr>
-        <w:tblStyle w:val="FigureTable"/>
-        <w:tblW w:type="auto" w:w="0"/>
-        <w:tblLook w:firstRow="0" w:lastRow="0" w:firstColumn="0" w:lastColumn="0"/>
-        <w:jc w:val="center"/>
-      </w:tblPr>
-      <w:tblGrid>
-        <w:gridCol w:w="7920"/>
-      </w:tblGrid>
-      <w:tr>
-        <w:tc>
-          <w:tcPr/>
-          <w:p>
-            <w:pPr>
-              <w:pStyle w:val="Compact"/>
-              <w:jc w:val="center"/>
-            </w:pPr>
-            <w:r>
-              <w:t xml:space="preserve">Рисунок 2.1 — Загальна архітектура інструменту: верстви та потоки даних</w:t>
-            </w:r>
-          </w:p>
-        </w:tc>
-      </w:tr>
-    </w:tbl>
+    <w:p>
+      <w:pPr>
+        <w:pStyle w:val="CaptionedFigure"/>
+      </w:pPr>
+      <w:r>
+        <w:drawing>
+          <wp:inline>
+            <wp:extent cx="5334000" cy="2204690"/>
+            <wp:effectExtent b="0" l="0" r="0" t="0"/>
+            <wp:docPr descr="Рисунок 2.1 — Загальна архітектура інструменту: верстви та потоки даних" title="" id="36" name="Picture"/>
+            <a:graphic>
+              <a:graphicData uri="http://schemas.openxmlformats.org/drawingml/2006/picture">
+                <pic:pic>
+                  <pic:nvPicPr>
+                    <pic:cNvPr descr="figures/architecture.png" id="37" name="Picture"/>
+                    <pic:cNvPicPr>
+                      <a:picLocks noChangeArrowheads="1" noChangeAspect="1"/>
+                    </pic:cNvPicPr>
+                  </pic:nvPicPr>
+                  <pic:blipFill>
+                    <a:blip r:embed="rId35"/>
+                    <a:stretch>
+                      <a:fillRect/>
+                    </a:stretch>
+                  </pic:blipFill>
+                  <pic:spPr bwMode="auto">
+                    <a:xfrm>
+                      <a:off x="0" y="0"/>
+                      <a:ext cx="5334000" cy="2204690"/>
+                    </a:xfrm>
+                    <a:prstGeom prst="rect">
+                      <a:avLst/>
+                    </a:prstGeom>
+                    <a:noFill/>
+                    <a:ln w="9525">
+                      <a:noFill/>
+                      <a:headEnd/>
+                      <a:tailEnd/>
+                    </a:ln>
+                  </pic:spPr>
+                </pic:pic>
+              </a:graphicData>
+            </a:graphic>
+          </wp:inline>
+        </w:drawing>
+      </w:r>
+    </w:p>
     <w:p>
       <w:pPr>
         <w:pStyle w:val="ImageCaption"/>
@@ -1735,8 +1757,8 @@
         <w:t xml:space="preserve">Рисунок 2.1 — Загальна архітектура інструменту: верстви та потоки даних</w:t>
       </w:r>
     </w:p>
-    <w:bookmarkEnd w:id="35"/>
-    <w:bookmarkStart w:id="36" w:name="Xff3afddbcdf64f892da0777a430d12df7128107"/>
+    <w:bookmarkEnd w:id="38"/>
+    <w:bookmarkStart w:id="39" w:name="Xff3afddbcdf64f892da0777a430d12df7128107"/>
     <w:p>
       <w:pPr>
         <w:pStyle w:val="Heading2"/>
@@ -1996,8 +2018,8 @@
         <w:t xml:space="preserve">коментарях; будь-яка нормалізація знищила б ці сигнали.</w:t>
       </w:r>
     </w:p>
-    <w:bookmarkEnd w:id="36"/>
-    <w:bookmarkStart w:id="37" w:name="модель-даних-і-збереження-стану"/>
+    <w:bookmarkEnd w:id="39"/>
+    <w:bookmarkStart w:id="40" w:name="модель-даних-і-збереження-стану"/>
     <w:p>
       <w:pPr>
         <w:pStyle w:val="Heading2"/>
@@ -2487,8 +2509,8 @@
         </w:tc>
       </w:tr>
     </w:tbl>
-    <w:bookmarkEnd w:id="37"/>
-    <w:bookmarkStart w:id="38" w:name="X9146b78f2820b7418b39f16f9aec1ffc975a937"/>
+    <w:bookmarkEnd w:id="40"/>
+    <w:bookmarkStart w:id="41" w:name="X9146b78f2820b7418b39f16f9aec1ffc975a937"/>
     <w:p>
       <w:pPr>
         <w:pStyle w:val="Heading2"/>
@@ -2545,9 +2567,9 @@
         <w:t xml:space="preserve">Загальний ранг сабмішну в дашборді (розділ 5.2) обчислюється як прозоро задокументована зважена сума ознак; кожен сигнал має фіксовану вагу, що задана у конфігурації. Викладач у будь-який момент може пересортувати дашборд за окремим сигналом, відключити сигнал, що йому не довіряє, або переглянути сабмішн повністю, ігноруючи рейтинг. Це методологічний приклад «контрольованої автоматизації»: машина допомагає звузити коло уваги, але не приймає рішень за людину.</w:t>
       </w:r>
     </w:p>
-    <w:bookmarkEnd w:id="38"/>
-    <w:bookmarkEnd w:id="39"/>
-    <w:bookmarkStart w:id="46" w:name="X6531f5b3832274013d057a87936559d3e9dcd51"/>
+    <w:bookmarkEnd w:id="41"/>
+    <w:bookmarkEnd w:id="42"/>
+    <w:bookmarkStart w:id="49" w:name="X6531f5b3832274013d057a87936559d3e9dcd51"/>
     <w:p>
       <w:pPr>
         <w:pStyle w:val="Heading1"/>
@@ -2679,7 +2701,7 @@
         <w:t xml:space="preserve">-об’єкт із указанням каналу, числової оцінки й переліку спанів.</w:t>
       </w:r>
     </w:p>
-    <w:bookmarkStart w:id="40" w:name="нормалізація-токенового-потоку"/>
+    <w:bookmarkStart w:id="43" w:name="нормалізація-токенового-потоку"/>
     <w:p>
       <w:pPr>
         <w:pStyle w:val="Heading2"/>
@@ -2904,8 +2926,8 @@
         <w:t xml:space="preserve">— нормалізована категорія, символьні координати в оригінальному джерелі й оригінальний текст. Координати потрібні для подальшого підсвічування спанів у дашборді.</w:t>
       </w:r>
     </w:p>
-    <w:bookmarkEnd w:id="40"/>
-    <w:bookmarkStart w:id="41" w:name="канал-winnowing-фінгерпринтів"/>
+    <w:bookmarkEnd w:id="43"/>
+    <w:bookmarkStart w:id="44" w:name="канал-winnowing-фінгерпринтів"/>
     <w:p>
       <w:pPr>
         <w:pStyle w:val="Heading2"/>
@@ -3876,8 +3898,8 @@
         <w:t xml:space="preserve">із указанням координат у обох сабмішнах і коротких витягів тексту.</w:t>
       </w:r>
     </w:p>
-    <w:bookmarkEnd w:id="41"/>
-    <w:bookmarkStart w:id="42" w:name="канал-хешів-піддерев-ast"/>
+    <w:bookmarkEnd w:id="44"/>
+    <w:bookmarkStart w:id="45" w:name="канал-хешів-піддерев-ast"/>
     <w:p>
       <w:pPr>
         <w:pStyle w:val="Heading2"/>
@@ -4317,8 +4339,8 @@
         <w:t xml:space="preserve">стандартно дорівнює 0.45 — вище за поріг Winnowing-каналу, бо хешів піддерев менше за фінгерпринтів, і випадковий збіг між рекурсивним fib і мемоїзованим fib без вищого порогу дає ~0.30, що недостатньо для надійного відмежування.</w:t>
       </w:r>
     </w:p>
-    <w:bookmarkEnd w:id="42"/>
-    <w:bookmarkStart w:id="43" w:name="обєднання-каналів-і-ранжування-пар"/>
+    <w:bookmarkEnd w:id="45"/>
+    <w:bookmarkStart w:id="46" w:name="обєднання-каналів-і-ранжування-пар"/>
     <w:p>
       <w:pPr>
         <w:pStyle w:val="Heading2"/>
@@ -4482,8 +4504,8 @@
         <w:t xml:space="preserve">= 3.0, що відображає вищу інтерпретативну вагу довгого Winnowing-спану в порівнянні з абстрактним структурним збігом.</w:t>
       </w:r>
     </w:p>
-    <w:bookmarkEnd w:id="43"/>
-    <w:bookmarkStart w:id="44" w:name="Xafbdd60252c7c90ed106b0fbf09f8fc0859b634"/>
+    <w:bookmarkEnd w:id="46"/>
+    <w:bookmarkStart w:id="47" w:name="Xafbdd60252c7c90ed106b0fbf09f8fc0859b634"/>
     <w:p>
       <w:pPr>
         <w:pStyle w:val="Heading2"/>
@@ -4734,8 +4756,8 @@
         <w:t xml:space="preserve">Стандартні параметри обрано емпірично з огляду на пары, типові для вступних курсів програмування (bubble sort, фібоначчі, факторіал, бінарний пошук). На завданнях, де всі правильні розв’язки лексично подібні (різні написання того самого алгоритму на 8 рядків), пороги слід знизити; для проєктних робіт із 500+ рядків — підвищити. Параметри винесено в конфігурацію без зміни коду.</w:t>
       </w:r>
     </w:p>
-    <w:bookmarkEnd w:id="44"/>
-    <w:bookmarkStart w:id="45" w:name="емпірична-оцінка-обох-каналів"/>
+    <w:bookmarkEnd w:id="47"/>
+    <w:bookmarkStart w:id="48" w:name="емпірична-оцінка-обох-каналів"/>
     <w:p>
       <w:pPr>
         <w:pStyle w:val="Heading2"/>
@@ -5310,9 +5332,9 @@
         <w:t xml:space="preserve">плюс окремий ручний прогін) канали поводяться очікувано: account4 з завдання «bubble sort» — перейменована копія account1 — реєструється обома каналами з оцінками 0.76 (Winnowing) і ~0.7 (AST), що значно вище за пороги; account2 — текст із publicly-published джерела з невеликими модифікаціями — отримує помітну, але нижчу оцінку лише в Winnowing (порядку 0.45). У завданні «factorial» три різні реалізації (ітеративна, рекурсивна, мемоїзована) дають оцінки в межах 0.20–0.35 — не нижче за випадковий шум, але нижче за поріг ухвалення; жодне попередження не з’являється для цього завдання. Цей дослід підтверджує, що пороги обрано так, щоб поведінка на реальних, але семантично різних реалізаціях того самого завдання залишалася консервативною.</w:t>
       </w:r>
     </w:p>
-    <w:bookmarkEnd w:id="45"/>
-    <w:bookmarkEnd w:id="46"/>
-    <w:bookmarkStart w:id="52" w:name="X37162b3cb27c821d2068fee7ef1f8600d0e9c2d"/>
+    <w:bookmarkEnd w:id="48"/>
+    <w:bookmarkEnd w:id="49"/>
+    <w:bookmarkStart w:id="55" w:name="X37162b3cb27c821d2068fee7ef1f8600d0e9c2d"/>
     <w:p>
       <w:pPr>
         <w:pStyle w:val="Heading1"/>
@@ -5321,7 +5343,7 @@
         <w:t xml:space="preserve">4 ТАКСОНОМІЯ ОЗНАК НЕДБАЛОГО ВИКОРИСТАННЯ МОВНИХ МОДЕЛЕЙ У КОДІ</w:t>
       </w:r>
     </w:p>
-    <w:bookmarkStart w:id="47" w:name="X362e71150ac72387289fe00438fe9fa964ab779"/>
+    <w:bookmarkStart w:id="50" w:name="X362e71150ac72387289fe00438fe9fa964ab779"/>
     <w:p>
       <w:pPr>
         <w:pStyle w:val="Heading2"/>
@@ -5442,8 +5464,8 @@
         <w:t xml:space="preserve">Усі правила побудовані з огляду на те, що сабмішн — це файл вихідного коду; вони шукають артефакти всередині коментарів, документації функцій, а також зайвих ліній на кшталт markdown-розмітки, що пережила копіювання з інтерфейсу чату.</w:t>
       </w:r>
     </w:p>
-    <w:bookmarkEnd w:id="47"/>
-    <w:bookmarkStart w:id="48" w:name="категорії-й-перелік-правил"/>
+    <w:bookmarkEnd w:id="50"/>
+    <w:bookmarkStart w:id="51" w:name="категорії-й-перелік-правил"/>
     <w:p>
       <w:pPr>
         <w:pStyle w:val="Heading2"/>
@@ -6210,8 +6232,8 @@
         <w:t xml:space="preserve">— український відмовний лід «На жаль, я не можу надати…».</w:t>
       </w:r>
     </w:p>
-    <w:bookmarkEnd w:id="48"/>
-    <w:bookmarkStart w:id="49" w:name="інженерія-правил-як-даних"/>
+    <w:bookmarkEnd w:id="51"/>
+    <w:bookmarkStart w:id="52" w:name="інженерія-правил-як-даних"/>
     <w:p>
       <w:pPr>
         <w:pStyle w:val="Heading2"/>
@@ -6559,8 +6581,8 @@
         <w:t xml:space="preserve">з єдиним контрактом для верстви звіту.</w:t>
       </w:r>
     </w:p>
-    <w:bookmarkEnd w:id="49"/>
-    <w:bookmarkStart w:id="50" w:name="чому-правила-а-не-ml-класифікатор"/>
+    <w:bookmarkEnd w:id="52"/>
+    <w:bookmarkStart w:id="53" w:name="чому-правила-а-не-ml-класифікатор"/>
     <w:p>
       <w:pPr>
         <w:pStyle w:val="Heading2"/>
@@ -6697,8 +6719,8 @@
         <w:t xml:space="preserve">Цю позицію виражено в інтерфейсі: біля кожного спрацювання правил таксономії відображено формулу «спрацювало правило X (точність на корпусі Y: P) — рекомендуємо переглянути виділений фрагмент». Тон формулювань підкреслює саме рекомендаційний характер сигналу.</w:t>
       </w:r>
     </w:p>
-    <w:bookmarkEnd w:id="50"/>
-    <w:bookmarkStart w:id="51" w:name="емпірична-оцінка-таксономії"/>
+    <w:bookmarkEnd w:id="53"/>
+    <w:bookmarkStart w:id="54" w:name="емпірична-оцінка-таксономії"/>
     <w:p>
       <w:pPr>
         <w:pStyle w:val="Heading2"/>
@@ -9170,9 +9192,9 @@
         <w:t xml:space="preserve">Ідеальні значення на синтетичному корпусі є очікуваними з огляду на дві обставини: (а) правила побудовані під конкретні артефакти, які генератор синтетичних позитивів вставляє в текст без шуму; (б) синтетичні негативні приклади — це чисті сорси без двозначних формулювань. Для верхньої оцінки правил такого корпусу досить; для нижчої оцінки потрібна перевірка на реальних студентських сабмішнях. Збір такого корпусу, заявлений як подальша робота, дасть змогу диференціювати правила за стійкістю до реальних шумів і потенційно деактивувати ті, чия точність на реальних даних падає нижче за поріг.</w:t>
       </w:r>
     </w:p>
-    <w:bookmarkEnd w:id="51"/>
-    <w:bookmarkEnd w:id="52"/>
-    <w:bookmarkStart w:id="58" w:name="Xf364e1539aaa70cdb502e3b45ef757dd6628684"/>
+    <w:bookmarkEnd w:id="54"/>
+    <w:bookmarkEnd w:id="55"/>
+    <w:bookmarkStart w:id="61" w:name="Xf364e1539aaa70cdb502e3b45ef757dd6628684"/>
     <w:p>
       <w:pPr>
         <w:pStyle w:val="Heading1"/>
@@ -9181,7 +9203,7 @@
         <w:t xml:space="preserve">5 ІНТЕГРАЦІЯ СИГНАЛІВ, ІНТЕРФЕЙС ВИКЛАДАЧА Й ЗАГАЛЬНЕ ОЦІНЮВАННЯ</w:t>
       </w:r>
     </w:p>
-    <w:bookmarkStart w:id="53" w:name="канал-зовнішнього-веб-плагіату"/>
+    <w:bookmarkStart w:id="56" w:name="канал-зовнішнього-веб-плагіату"/>
     <w:p>
       <w:pPr>
         <w:pStyle w:val="Heading2"/>
@@ -9284,8 +9306,8 @@
         <w:t xml:space="preserve">. У звіті по сабмішну окремо позначено, що цей сигнал — зовнішній: викладач має знати, чий індекс «бачить» спрацювання і яке обмеження на доменне покриття існує.</w:t>
       </w:r>
     </w:p>
-    <w:bookmarkEnd w:id="53"/>
-    <w:bookmarkStart w:id="54" w:name="ранжування-сабмішнів"/>
+    <w:bookmarkEnd w:id="56"/>
+    <w:bookmarkStart w:id="57" w:name="ранжування-сабмішнів"/>
     <w:p>
       <w:pPr>
         <w:pStyle w:val="Heading2"/>
@@ -10243,8 +10265,8 @@
         <w:t xml:space="preserve">, кількість когортних збігів, ваговий бал) показано окремо поряд із підсумком. Викладач у будь-який момент може пересортувати таблицю за окремою колонкою.</w:t>
       </w:r>
     </w:p>
-    <w:bookmarkEnd w:id="54"/>
-    <w:bookmarkStart w:id="55" w:name="інтерфейс-викладача"/>
+    <w:bookmarkEnd w:id="57"/>
+    <w:bookmarkStart w:id="58" w:name="інтерфейс-викладача"/>
     <w:p>
       <w:pPr>
         <w:pStyle w:val="Heading2"/>
@@ -10360,7 +10382,7 @@
               <w:jc w:val="center"/>
             </w:pPr>
             <w:r>
-              <w:t xml:space="preserve">Рисунок 5.1 — Сторінка завдання: ранжована таблиця сабмішнів</w:t>
+              <w:t xml:space="preserve">Рисунок 5.1 — Сторінка завдання Task1 (Bubble sort): ранжована таблиця сабмішнів з посигнальними оцінками AI leakage, Cohort matches, Web hits та підсумковим балом Suspicion</w:t>
             </w:r>
           </w:p>
         </w:tc>
@@ -10371,7 +10393,7 @@
         <w:pStyle w:val="ImageCaption"/>
       </w:pPr>
       <w:r>
-        <w:t xml:space="preserve">Рисунок 5.1 — Сторінка завдання: ранжована таблиця сабмішнів</w:t>
+        <w:t xml:space="preserve">Рисунок 5.1 — Сторінка завдання Task1 (Bubble sort): ранжована таблиця сабмішнів з посигнальними оцінками AI leakage, Cohort matches, Web hits та підсумковим балом Suspicion</w:t>
       </w:r>
     </w:p>
     <w:tbl>
@@ -10393,7 +10415,7 @@
               <w:jc w:val="center"/>
             </w:pPr>
             <w:r>
-              <w:t xml:space="preserve">Рисунок 5.2 — Сторінка сабмішну: підсвічені спани й перелік доказів</w:t>
+              <w:t xml:space="preserve">Рисунок 5.2 — Сторінка завдання Task2 (Limitations showcase): сабмішни з одиничними правилами таксономії, що демонструють очікувані хибно-позитивні зразки в чесному коді</w:t>
             </w:r>
           </w:p>
         </w:tc>
@@ -10404,11 +10426,110 @@
         <w:pStyle w:val="ImageCaption"/>
       </w:pPr>
       <w:r>
-        <w:t xml:space="preserve">Рисунок 5.2 — Сторінка сабмішну: підсвічені спани й перелік доказів</w:t>
-      </w:r>
-    </w:p>
-    <w:bookmarkEnd w:id="55"/>
-    <w:bookmarkStart w:id="56" w:name="X4a6fade3f4a89acd1014115bfcf1bb5ef369cda"/>
+        <w:t xml:space="preserve">Рисунок 5.2 — Сторінка завдання Task2 (Limitations showcase): сабмішни з одиничними правилами таксономії, що демонструють очікувані хибно-позитивні зразки в чесному коді</w:t>
+      </w:r>
+    </w:p>
+    <w:tbl>
+      <w:tblPr>
+        <w:tblStyle w:val="FigureTable"/>
+        <w:tblW w:type="auto" w:w="0"/>
+        <w:tblLook w:firstRow="0" w:lastRow="0" w:firstColumn="0" w:lastColumn="0"/>
+        <w:jc w:val="center"/>
+      </w:tblPr>
+      <w:tblGrid>
+        <w:gridCol w:w="7920"/>
+      </w:tblGrid>
+      <w:tr>
+        <w:tc>
+          <w:tcPr/>
+          <w:p>
+            <w:pPr>
+              <w:pStyle w:val="Compact"/>
+              <w:jc w:val="center"/>
+            </w:pPr>
+            <w:r>
+              <w:t xml:space="preserve">Рисунок 5.3 — Сторінка завдання Task3 (Fibonacci): три семантично різні реалізації того самого алгоритму, для яких канали когортного порівняння не реєструють збігів</w:t>
+            </w:r>
+          </w:p>
+        </w:tc>
+      </w:tr>
+    </w:tbl>
+    <w:p>
+      <w:pPr>
+        <w:pStyle w:val="ImageCaption"/>
+      </w:pPr>
+      <w:r>
+        <w:t xml:space="preserve">Рисунок 5.3 — Сторінка завдання Task3 (Fibonacci): три семантично різні реалізації того самого алгоритму, для яких канали когортного порівняння не реєструють збігів</w:t>
+      </w:r>
+    </w:p>
+    <w:tbl>
+      <w:tblPr>
+        <w:tblStyle w:val="FigureTable"/>
+        <w:tblW w:type="auto" w:w="0"/>
+        <w:tblLook w:firstRow="0" w:lastRow="0" w:firstColumn="0" w:lastColumn="0"/>
+        <w:jc w:val="center"/>
+      </w:tblPr>
+      <w:tblGrid>
+        <w:gridCol w:w="7920"/>
+      </w:tblGrid>
+      <w:tr>
+        <w:tc>
+          <w:tcPr/>
+          <w:p>
+            <w:pPr>
+              <w:pStyle w:val="Compact"/>
+              <w:jc w:val="center"/>
+            </w:pPr>
+            <w:r>
+              <w:t xml:space="preserve">Рисунок 5.4 — Сторінка сабмішну: текст із підсвіченими спанами, перелік 9 спрацювань таксономії з описом і доказом-фразою для кожного правила</w:t>
+            </w:r>
+          </w:p>
+        </w:tc>
+      </w:tr>
+    </w:tbl>
+    <w:p>
+      <w:pPr>
+        <w:pStyle w:val="ImageCaption"/>
+      </w:pPr>
+      <w:r>
+        <w:t xml:space="preserve">Рисунок 5.4 — Сторінка сабмішну: текст із підсвіченими спанами, перелік 9 спрацювань таксономії з описом і доказом-фразою для кожного правила</w:t>
+      </w:r>
+    </w:p>
+    <w:tbl>
+      <w:tblPr>
+        <w:tblStyle w:val="FigureTable"/>
+        <w:tblW w:type="auto" w:w="0"/>
+        <w:tblLook w:firstRow="0" w:lastRow="0" w:firstColumn="0" w:lastColumn="0"/>
+        <w:jc w:val="center"/>
+      </w:tblPr>
+      <w:tblGrid>
+        <w:gridCol w:w="7920"/>
+      </w:tblGrid>
+      <w:tr>
+        <w:tc>
+          <w:tcPr/>
+          <w:p>
+            <w:pPr>
+              <w:pStyle w:val="Compact"/>
+              <w:jc w:val="center"/>
+            </w:pPr>
+            <w:r>
+              <w:t xml:space="preserve">Рисунок 5.5 — Сторінка сабмішну (продовження): 3 когортні збіги (Winnowing, Jaccard 0.76 / 0.76 / 0.45) з боксами «This submission / Other submission» для кожного спану</w:t>
+            </w:r>
+          </w:p>
+        </w:tc>
+      </w:tr>
+    </w:tbl>
+    <w:p>
+      <w:pPr>
+        <w:pStyle w:val="ImageCaption"/>
+      </w:pPr>
+      <w:r>
+        <w:t xml:space="preserve">Рисунок 5.5 — Сторінка сабмішну (продовження): 3 когортні збіги (Winnowing, Jaccard 0.76 / 0.76 / 0.45) з боксами «This submission / Other submission» для кожного спану</w:t>
+      </w:r>
+    </w:p>
+    <w:bookmarkEnd w:id="58"/>
+    <w:bookmarkStart w:id="59" w:name="X4a6fade3f4a89acd1014115bfcf1bb5ef369cda"/>
     <w:p>
       <w:pPr>
         <w:pStyle w:val="Heading2"/>
@@ -11472,8 +11593,8 @@
         <w:t xml:space="preserve">Дванадцять сабмішнів — це демонстраційний, а не статистично репрезентативний набір. Він підтверджує, що пайплайн працює коректно на типових кейсах і що ранжувальник дає очікуваний порядок, але не дозволяє статистично оцінити частоту хибних спрацювань на реальному потоці робіт. Кількісне оцінювання залишається предметом синтетичних експериментів окремих каналів (підрозділи 3.6, 4.5).</w:t>
       </w:r>
     </w:p>
-    <w:bookmarkEnd w:id="56"/>
-    <w:bookmarkStart w:id="57" w:name="обмеження-та-подальша-робота"/>
+    <w:bookmarkEnd w:id="59"/>
+    <w:bookmarkStart w:id="60" w:name="обмеження-та-подальша-робота"/>
     <w:p>
       <w:pPr>
         <w:pStyle w:val="Heading2"/>
@@ -11762,9 +11883,9 @@
         <w:t xml:space="preserve">— інструмент не покриває природномовну частину сабмішну (звіти, README, обґрунтування): прозовий шар делеговано загальним системам перевірки текстів (підрозділ 1.2). Інтегроване покриття обох шарів в одному дашборді — потенційний напрям майбутньої роботи.</w:t>
       </w:r>
     </w:p>
-    <w:bookmarkEnd w:id="57"/>
-    <w:bookmarkEnd w:id="58"/>
-    <w:bookmarkStart w:id="59" w:name="висновки"/>
+    <w:bookmarkEnd w:id="60"/>
+    <w:bookmarkEnd w:id="61"/>
+    <w:bookmarkStart w:id="62" w:name="висновки"/>
     <w:p>
       <w:pPr>
         <w:pStyle w:val="Heading1"/>
@@ -12064,8 +12185,8 @@
         <w:t xml:space="preserve">-протоколу, інтеграцію реального виклику Moss або Dolos у веб-каналі, збір та розмітку корпусу реальних студентських сабмішнів для нижньої оцінки якості та підтримку інших систем керування навчанням (Moodle, Canvas).</w:t>
       </w:r>
     </w:p>
-    <w:bookmarkEnd w:id="59"/>
-    <w:bookmarkStart w:id="60" w:name="перелік-джерел-посилання"/>
+    <w:bookmarkEnd w:id="62"/>
+    <w:bookmarkStart w:id="63" w:name="перелік-джерел-посилання"/>
     <w:p>
       <w:pPr>
         <w:pStyle w:val="Heading1"/>
@@ -12592,8 +12713,8 @@
         <w:t xml:space="preserve">. 2025.</w:t>
       </w:r>
     </w:p>
-    <w:bookmarkEnd w:id="60"/>
-    <w:bookmarkStart w:id="61" w:name="додаток-а"/>
+    <w:bookmarkEnd w:id="63"/>
+    <w:bookmarkStart w:id="64" w:name="додаток-а"/>
     <w:p>
       <w:pPr>
         <w:pStyle w:val="Heading1"/>
@@ -12602,8 +12723,8 @@
         <w:t xml:space="preserve">ДОДАТОК А</w:t>
       </w:r>
     </w:p>
-    <w:bookmarkEnd w:id="61"/>
-    <w:bookmarkStart w:id="62" w:name="приклад-звіту-по-сабмішну"/>
+    <w:bookmarkEnd w:id="64"/>
+    <w:bookmarkStart w:id="65" w:name="приклад-звіту-по-сабмішну"/>
     <w:p>
       <w:pPr>
         <w:pStyle w:val="Heading1"/>
@@ -13196,8 +13317,8 @@
         <w:t xml:space="preserve">(формула 5.1).</w:t>
       </w:r>
     </w:p>
-    <w:bookmarkEnd w:id="62"/>
-    <w:bookmarkStart w:id="63" w:name="додаток-б"/>
+    <w:bookmarkEnd w:id="65"/>
+    <w:bookmarkStart w:id="66" w:name="додаток-б"/>
     <w:p>
       <w:pPr>
         <w:pStyle w:val="Heading1"/>
@@ -13206,8 +13327,8 @@
         <w:t xml:space="preserve">ДОДАТОК Б</w:t>
       </w:r>
     </w:p>
-    <w:bookmarkEnd w:id="63"/>
-    <w:bookmarkStart w:id="64" w:name="повний-перелік-правил-таксономії"/>
+    <w:bookmarkEnd w:id="66"/>
+    <w:bookmarkStart w:id="67" w:name="повний-перелік-правил-таксономії"/>
     <w:p>
       <w:pPr>
         <w:pStyle w:val="Heading1"/>
@@ -14076,8 +14197,8 @@
         </w:tc>
       </w:tr>
     </w:tbl>
-    <w:bookmarkEnd w:id="64"/>
-    <w:bookmarkStart w:id="65" w:name="додаток-в"/>
+    <w:bookmarkEnd w:id="67"/>
+    <w:bookmarkStart w:id="68" w:name="додаток-в"/>
     <w:p>
       <w:pPr>
         <w:pStyle w:val="Heading1"/>
@@ -14086,8 +14207,8 @@
         <w:t xml:space="preserve">ДОДАТОК В</w:t>
       </w:r>
     </w:p>
-    <w:bookmarkEnd w:id="65"/>
-    <w:bookmarkStart w:id="66" w:name="X4ba685ed1c1b0a6be41f2fa2494ade5a29df8bb"/>
+    <w:bookmarkEnd w:id="68"/>
+    <w:bookmarkStart w:id="69" w:name="X4ba685ed1c1b0a6be41f2fa2494ade5a29df8bb"/>
     <w:p>
       <w:pPr>
         <w:pStyle w:val="Heading1"/>
@@ -14768,7 +14889,7 @@
         <w:t xml:space="preserve">у вигляді JSON-документа з повними метриками; репозиторій містить два збережені звіти останнього запуску, числа з яких процитовано в таблицях 3.1 і 4.1.</w:t>
       </w:r>
     </w:p>
-    <w:bookmarkEnd w:id="66"/>
+    <w:bookmarkEnd w:id="69"/>
     <w:sectPr/>
   </w:body>
 </w:document>

</xml_diff>

<commit_message>
Fix appendix layout and recognize markdown - bullets
Two real defects in the appendices:

1. Each appendix produced two page-breaking Heading 1 paragraphs
   («ДОДАТОК А» on one page, «Приклад звіту по сабмішну» as another
   H1 on the next). Per methodics §3.16, the appendix title sits
   directly under «ДОДАТОК Х» on the same page.
   - APPENDIX_RE-matched H1 now triggers add_top_level_heading
     followed by add_appendix_title, which centers the next H1
     block as a bold subtitle (no page break, no uppercasing),
     and the loop skips that consumed block.

2. Markdown - bullets («- comment.certainly_heres …») were not
   recognized — only «— …» and «а) …». They rendered as literal
   "- text" without any indent or bullet structure.
   - New LIST_HYPHEN_RE matches «- …» and routes to the same
     list_dash kind as «— …», so they render with the methodics-
     correct «—» marker and hanging indent.
</commit_message>
<xml_diff>
--- a/thesis/diploma.docx
+++ b/thesis/diploma.docx
@@ -20029,10 +20029,9 @@
     </w:p>
     <w:p>
       <w:pPr>
-        <w:pStyle w:val="1"/>
-        <w:pageBreakBefore/>
         <w:ind w:firstLine="0"/>
         <w:jc w:val="center"/>
+        <w:spacing w:after="360" w:line="360" w:lineRule="auto"/>
       </w:pPr>
       <w:r>
         <w:rPr>
@@ -20042,7 +20041,7 @@
           <w:sz w:val="28"/>
           <w:color w:val="000000"/>
         </w:rPr>
-        <w:t>ПРИКЛАД ЗВІТУ ПО САБМІШНУ</w:t>
+        <w:t>Приклад звіту по сабмішну</w:t>
       </w:r>
     </w:p>
     <w:p>
@@ -20162,7 +20161,7 @@
     <w:p>
       <w:pPr>
         <w:spacing w:before="0" w:after="0" w:line="360" w:lineRule="auto"/>
-        <w:ind w:firstLine="720" w:left="0" w:right="0"/>
+        <w:ind w:left="0" w:right="0" w:firstLine="720"/>
         <w:jc w:val="both"/>
       </w:pPr>
       <w:r>
@@ -20173,7 +20172,7 @@
           <w:sz w:val="28"/>
           <w:color w:val="000000"/>
         </w:rPr>
-        <w:t xml:space="preserve">- </w:t>
+        <w:t xml:space="preserve">— </w:t>
       </w:r>
       <w:r>
         <w:rPr>
@@ -20192,6 +20191,288 @@
           <w:color w:val="000000"/>
         </w:rPr>
         <w:t xml:space="preserve"> — преамбула «Certainly! Here» (позиція 2..17 у сорсі);</w:t>
+      </w:r>
+    </w:p>
+    <w:p>
+      <w:pPr>
+        <w:spacing w:before="0" w:after="0" w:line="360" w:lineRule="auto"/>
+        <w:ind w:left="0" w:right="0" w:firstLine="720"/>
+        <w:jc w:val="both"/>
+      </w:pPr>
+      <w:r>
+        <w:rPr>
+          <w:rFonts w:ascii="Times New Roman" w:hAnsi="Times New Roman" w:cs="Times New Roman" w:eastAsia="Times New Roman"/>
+          <w:b w:val="0"/>
+          <w:i w:val="0"/>
+          <w:sz w:val="28"/>
+          <w:color w:val="000000"/>
+        </w:rPr>
+        <w:t xml:space="preserve">— </w:t>
+      </w:r>
+      <w:r>
+        <w:rPr>
+          <w:rFonts w:ascii="Courier New" w:hAnsi="Courier New" w:cs="Courier New"/>
+          <w:sz w:val="24"/>
+          <w:color w:val="000000"/>
+        </w:rPr>
+        <w:t>boilerplate.time_complexity_inline</w:t>
+      </w:r>
+      <w:r>
+        <w:rPr>
+          <w:rFonts w:ascii="Times New Roman" w:hAnsi="Times New Roman" w:cs="Times New Roman" w:eastAsia="Times New Roman"/>
+          <w:b w:val="0"/>
+          <w:i w:val="0"/>
+          <w:sz w:val="28"/>
+          <w:color w:val="000000"/>
+        </w:rPr>
+        <w:t xml:space="preserve"> — інлайн-коментар «Time complexity: O(n^2)» (позиція 50..73);</w:t>
+      </w:r>
+    </w:p>
+    <w:p>
+      <w:pPr>
+        <w:spacing w:before="0" w:after="0" w:line="360" w:lineRule="auto"/>
+        <w:ind w:left="0" w:right="0" w:firstLine="720"/>
+        <w:jc w:val="both"/>
+      </w:pPr>
+      <w:r>
+        <w:rPr>
+          <w:rFonts w:ascii="Times New Roman" w:hAnsi="Times New Roman" w:cs="Times New Roman" w:eastAsia="Times New Roman"/>
+          <w:b w:val="0"/>
+          <w:i w:val="0"/>
+          <w:sz w:val="28"/>
+          <w:color w:val="000000"/>
+        </w:rPr>
+        <w:t xml:space="preserve">— </w:t>
+      </w:r>
+      <w:r>
+        <w:rPr>
+          <w:rFonts w:ascii="Courier New" w:hAnsi="Courier New" w:cs="Courier New"/>
+          <w:sz w:val="24"/>
+          <w:color w:val="000000"/>
+        </w:rPr>
+        <w:t>comment.explanation_block</w:t>
+      </w:r>
+      <w:r>
+        <w:rPr>
+          <w:rFonts w:ascii="Times New Roman" w:hAnsi="Times New Roman" w:cs="Times New Roman" w:eastAsia="Times New Roman"/>
+          <w:b w:val="0"/>
+          <w:i w:val="0"/>
+          <w:sz w:val="28"/>
+          <w:color w:val="000000"/>
+        </w:rPr>
+        <w:t xml:space="preserve"> — натуральномовна преамбула «This function takes a list and returns it sorted…» (позиція 78..115);</w:t>
+      </w:r>
+    </w:p>
+    <w:p>
+      <w:pPr>
+        <w:spacing w:before="0" w:after="0" w:line="360" w:lineRule="auto"/>
+        <w:ind w:left="0" w:right="0" w:firstLine="720"/>
+        <w:jc w:val="both"/>
+      </w:pPr>
+      <w:r>
+        <w:rPr>
+          <w:rFonts w:ascii="Times New Roman" w:hAnsi="Times New Roman" w:cs="Times New Roman" w:eastAsia="Times New Roman"/>
+          <w:b w:val="0"/>
+          <w:i w:val="0"/>
+          <w:sz w:val="28"/>
+          <w:color w:val="000000"/>
+        </w:rPr>
+        <w:t xml:space="preserve">— </w:t>
+      </w:r>
+      <w:r>
+        <w:rPr>
+          <w:rFonts w:ascii="Courier New" w:hAnsi="Courier New" w:cs="Courier New"/>
+          <w:sz w:val="24"/>
+          <w:color w:val="000000"/>
+        </w:rPr>
+        <w:t>comment.i_hope_this_helps</w:t>
+      </w:r>
+      <w:r>
+        <w:rPr>
+          <w:rFonts w:ascii="Times New Roman" w:hAnsi="Times New Roman" w:cs="Times New Roman" w:eastAsia="Times New Roman"/>
+          <w:b w:val="0"/>
+          <w:i w:val="0"/>
+          <w:sz w:val="28"/>
+          <w:color w:val="000000"/>
+        </w:rPr>
+        <w:t xml:space="preserve"> × 2 — підписи «I hope this helps» і «Let me know if you have any questions» (позиції 220..238 і 244..280);</w:t>
+      </w:r>
+    </w:p>
+    <w:p>
+      <w:pPr>
+        <w:spacing w:before="0" w:after="0" w:line="360" w:lineRule="auto"/>
+        <w:ind w:left="0" w:right="0" w:firstLine="720"/>
+        <w:jc w:val="both"/>
+      </w:pPr>
+      <w:r>
+        <w:rPr>
+          <w:rFonts w:ascii="Times New Roman" w:hAnsi="Times New Roman" w:cs="Times New Roman" w:eastAsia="Times New Roman"/>
+          <w:b w:val="0"/>
+          <w:i w:val="0"/>
+          <w:sz w:val="28"/>
+          <w:color w:val="000000"/>
+        </w:rPr>
+        <w:t xml:space="preserve">— </w:t>
+      </w:r>
+      <w:r>
+        <w:rPr>
+          <w:rFonts w:ascii="Courier New" w:hAnsi="Courier New" w:cs="Courier New"/>
+          <w:sz w:val="24"/>
+          <w:color w:val="000000"/>
+        </w:rPr>
+        <w:t>markdown.code_fence_in_source</w:t>
+      </w:r>
+      <w:r>
+        <w:rPr>
+          <w:rFonts w:ascii="Times New Roman" w:hAnsi="Times New Roman" w:cs="Times New Roman" w:eastAsia="Times New Roman"/>
+          <w:b w:val="0"/>
+          <w:i w:val="0"/>
+          <w:sz w:val="28"/>
+          <w:color w:val="000000"/>
+        </w:rPr>
+        <w:t xml:space="preserve"> × 2 — потрійні backticks </w:t>
+      </w:r>
+      <w:r>
+        <w:rPr>
+          <w:rFonts w:ascii="Courier New" w:hAnsi="Courier New" w:cs="Courier New"/>
+          <w:sz w:val="24"/>
+          <w:color w:val="000000"/>
+        </w:rPr>
+        <w:t>​</w:t>
+      </w:r>
+      <w:r>
+        <w:rPr>
+          <w:rFonts w:ascii="Times New Roman" w:hAnsi="Times New Roman" w:cs="Times New Roman" w:eastAsia="Times New Roman"/>
+          <w:b w:val="0"/>
+          <w:i w:val="0"/>
+          <w:sz w:val="28"/>
+          <w:color w:val="000000"/>
+        </w:rPr>
+        <w:t>``` (позиції 296..299, 480..483);</w:t>
+      </w:r>
+    </w:p>
+    <w:p>
+      <w:pPr>
+        <w:spacing w:before="0" w:after="0" w:line="360" w:lineRule="auto"/>
+        <w:ind w:left="0" w:right="0" w:firstLine="720"/>
+        <w:jc w:val="both"/>
+      </w:pPr>
+      <w:r>
+        <w:rPr>
+          <w:rFonts w:ascii="Times New Roman" w:hAnsi="Times New Roman" w:cs="Times New Roman" w:eastAsia="Times New Roman"/>
+          <w:b w:val="0"/>
+          <w:i w:val="0"/>
+          <w:sz w:val="28"/>
+          <w:color w:val="000000"/>
+        </w:rPr>
+        <w:t xml:space="preserve">— </w:t>
+      </w:r>
+      <w:r>
+        <w:rPr>
+          <w:rFonts w:ascii="Courier New" w:hAnsi="Courier New" w:cs="Courier New"/>
+          <w:sz w:val="24"/>
+          <w:color w:val="000000"/>
+        </w:rPr>
+        <w:t>markdown.language_fence_in_source</w:t>
+      </w:r>
+      <w:r>
+        <w:rPr>
+          <w:rFonts w:ascii="Times New Roman" w:hAnsi="Times New Roman" w:cs="Times New Roman" w:eastAsia="Times New Roman"/>
+          <w:b w:val="0"/>
+          <w:i w:val="0"/>
+          <w:sz w:val="28"/>
+          <w:color w:val="000000"/>
+        </w:rPr>
+        <w:t xml:space="preserve"> — мовний маркер </w:t>
+      </w:r>
+      <w:r>
+        <w:rPr>
+          <w:rFonts w:ascii="Courier New" w:hAnsi="Courier New" w:cs="Courier New"/>
+          <w:sz w:val="24"/>
+          <w:color w:val="000000"/>
+        </w:rPr>
+        <w:t>​</w:t>
+      </w:r>
+      <w:r>
+        <w:rPr>
+          <w:rFonts w:ascii="Times New Roman" w:hAnsi="Times New Roman" w:cs="Times New Roman" w:eastAsia="Times New Roman"/>
+          <w:b w:val="0"/>
+          <w:i w:val="0"/>
+          <w:sz w:val="28"/>
+          <w:color w:val="000000"/>
+        </w:rPr>
+        <w:t>`</w:t>
+      </w:r>
+      <w:r>
+        <w:rPr>
+          <w:rFonts w:ascii="Courier New" w:hAnsi="Courier New" w:cs="Courier New"/>
+          <w:sz w:val="24"/>
+          <w:color w:val="000000"/>
+        </w:rPr>
+        <w:t>python</w:t>
+      </w:r>
+      <w:r>
+        <w:rPr>
+          <w:rFonts w:ascii="Times New Roman" w:hAnsi="Times New Roman" w:cs="Times New Roman" w:eastAsia="Times New Roman"/>
+          <w:b w:val="0"/>
+          <w:i w:val="0"/>
+          <w:sz w:val="28"/>
+          <w:color w:val="000000"/>
+        </w:rPr>
+        <w:t xml:space="preserve"> (позиція 296..305);</w:t>
+      </w:r>
+    </w:p>
+    <w:p>
+      <w:pPr>
+        <w:spacing w:before="0" w:after="0" w:line="360" w:lineRule="auto"/>
+        <w:ind w:left="0" w:right="0" w:firstLine="720"/>
+        <w:jc w:val="both"/>
+      </w:pPr>
+      <w:r>
+        <w:rPr>
+          <w:rFonts w:ascii="Times New Roman" w:hAnsi="Times New Roman" w:cs="Times New Roman" w:eastAsia="Times New Roman"/>
+          <w:b w:val="0"/>
+          <w:i w:val="0"/>
+          <w:sz w:val="28"/>
+          <w:color w:val="000000"/>
+        </w:rPr>
+        <w:t xml:space="preserve">— </w:t>
+      </w:r>
+      <w:r>
+        <w:rPr>
+          <w:rFonts w:ascii="Courier New" w:hAnsi="Courier New" w:cs="Courier New"/>
+          <w:sz w:val="24"/>
+          <w:color w:val="000000"/>
+        </w:rPr>
+        <w:t>boilerplate.example_usage_comment</w:t>
+      </w:r>
+      <w:r>
+        <w:rPr>
+          <w:rFonts w:ascii="Times New Roman" w:hAnsi="Times New Roman" w:cs="Times New Roman" w:eastAsia="Times New Roman"/>
+          <w:b w:val="0"/>
+          <w:i w:val="0"/>
+          <w:sz w:val="28"/>
+          <w:color w:val="000000"/>
+        </w:rPr>
+        <w:t xml:space="preserve"> — секція </w:t>
+      </w:r>
+      <w:r>
+        <w:rPr>
+          <w:rFonts w:ascii="Courier New" w:hAnsi="Courier New" w:cs="Courier New"/>
+          <w:sz w:val="24"/>
+          <w:color w:val="000000"/>
+        </w:rPr>
+        <w:t># Example usage:</w:t>
+      </w:r>
+      <w:r>
+        <w:rPr>
+          <w:rFonts w:ascii="Times New Roman" w:hAnsi="Times New Roman" w:cs="Times New Roman" w:eastAsia="Times New Roman"/>
+          <w:b w:val="0"/>
+          <w:i w:val="0"/>
+          <w:sz w:val="28"/>
+          <w:color w:val="000000"/>
+        </w:rPr>
+        <w:t xml:space="preserve"> (позиція 488..505).</w:t>
       </w:r>
     </w:p>
     <w:p>
@@ -20203,12 +20484,29 @@
       <w:r>
         <w:rPr>
           <w:rFonts w:ascii="Times New Roman" w:hAnsi="Times New Roman" w:cs="Times New Roman" w:eastAsia="Times New Roman"/>
-          <w:b w:val="0"/>
-          <w:i w:val="0"/>
-          <w:sz w:val="28"/>
-          <w:color w:val="000000"/>
-        </w:rPr>
-        <w:t xml:space="preserve">- </w:t>
+          <w:b/>
+          <w:i w:val="0"/>
+          <w:sz w:val="28"/>
+          <w:color w:val="000000"/>
+        </w:rPr>
+        <w:t>Спрацювання сигналу cohort (3 збіги, канал `winnowing`):</w:t>
+      </w:r>
+    </w:p>
+    <w:p>
+      <w:pPr>
+        <w:spacing w:before="0" w:after="0" w:line="360" w:lineRule="auto"/>
+        <w:ind w:left="0" w:right="0" w:firstLine="720"/>
+        <w:jc w:val="both"/>
+      </w:pPr>
+      <w:r>
+        <w:rPr>
+          <w:rFonts w:ascii="Times New Roman" w:hAnsi="Times New Roman" w:cs="Times New Roman" w:eastAsia="Times New Roman"/>
+          <w:b w:val="0"/>
+          <w:i w:val="0"/>
+          <w:sz w:val="28"/>
+          <w:color w:val="000000"/>
+        </w:rPr>
+        <w:t xml:space="preserve">— Match with Студент No2 (account2-web-copy.py) — Jaccard 0.76, 4 спани (спільний кістяк </w:t>
       </w:r>
       <w:r>
         <w:rPr>
@@ -20216,34 +20514,17 @@
           <w:sz w:val="24"/>
           <w:color w:val="000000"/>
         </w:rPr>
-        <w:t>boilerplate.time_complexity_inline</w:t>
-      </w:r>
-      <w:r>
-        <w:rPr>
-          <w:rFonts w:ascii="Times New Roman" w:hAnsi="Times New Roman" w:cs="Times New Roman" w:eastAsia="Times New Roman"/>
-          <w:b w:val="0"/>
-          <w:i w:val="0"/>
-          <w:sz w:val="28"/>
-          <w:color w:val="000000"/>
-        </w:rPr>
-        <w:t xml:space="preserve"> — інлайн-коментар «Time complexity: O(n^2)» (позиція 50..73);</w:t>
-      </w:r>
-    </w:p>
-    <w:p>
-      <w:pPr>
-        <w:spacing w:before="0" w:after="0" w:line="360" w:lineRule="auto"/>
-        <w:ind w:firstLine="720" w:left="0" w:right="0"/>
-        <w:jc w:val="both"/>
-      </w:pPr>
-      <w:r>
-        <w:rPr>
-          <w:rFonts w:ascii="Times New Roman" w:hAnsi="Times New Roman" w:cs="Times New Roman" w:eastAsia="Times New Roman"/>
-          <w:b w:val="0"/>
-          <w:i w:val="0"/>
-          <w:sz w:val="28"/>
-          <w:color w:val="000000"/>
-        </w:rPr>
-        <w:t xml:space="preserve">- </w:t>
+        <w:t>for j in range</w:t>
+      </w:r>
+      <w:r>
+        <w:rPr>
+          <w:rFonts w:ascii="Times New Roman" w:hAnsi="Times New Roman" w:cs="Times New Roman" w:eastAsia="Times New Roman"/>
+          <w:b w:val="0"/>
+          <w:i w:val="0"/>
+          <w:sz w:val="28"/>
+          <w:color w:val="000000"/>
+        </w:rPr>
+        <w:t xml:space="preserve">, </w:t>
       </w:r>
       <w:r>
         <w:rPr>
@@ -20251,34 +20532,17 @@
           <w:sz w:val="24"/>
           <w:color w:val="000000"/>
         </w:rPr>
-        <w:t>comment.explanation_block</w:t>
-      </w:r>
-      <w:r>
-        <w:rPr>
-          <w:rFonts w:ascii="Times New Roman" w:hAnsi="Times New Roman" w:cs="Times New Roman" w:eastAsia="Times New Roman"/>
-          <w:b w:val="0"/>
-          <w:i w:val="0"/>
-          <w:sz w:val="28"/>
-          <w:color w:val="000000"/>
-        </w:rPr>
-        <w:t xml:space="preserve"> — натуральномовна преамбула «This function takes a list and returns it sorted…» (позиція 78..115);</w:t>
-      </w:r>
-    </w:p>
-    <w:p>
-      <w:pPr>
-        <w:spacing w:before="0" w:after="0" w:line="360" w:lineRule="auto"/>
-        <w:ind w:firstLine="720" w:left="0" w:right="0"/>
-        <w:jc w:val="both"/>
-      </w:pPr>
-      <w:r>
-        <w:rPr>
-          <w:rFonts w:ascii="Times New Roman" w:hAnsi="Times New Roman" w:cs="Times New Roman" w:eastAsia="Times New Roman"/>
-          <w:b w:val="0"/>
-          <w:i w:val="0"/>
-          <w:sz w:val="28"/>
-          <w:color w:val="000000"/>
-        </w:rPr>
-        <w:t xml:space="preserve">- </w:t>
+        <w:t>lst[j]</w:t>
+      </w:r>
+      <w:r>
+        <w:rPr>
+          <w:rFonts w:ascii="Times New Roman" w:hAnsi="Times New Roman" w:cs="Times New Roman" w:eastAsia="Times New Roman"/>
+          <w:b w:val="0"/>
+          <w:i w:val="0"/>
+          <w:sz w:val="28"/>
+          <w:color w:val="000000"/>
+        </w:rPr>
+        <w:t xml:space="preserve">, </w:t>
       </w:r>
       <w:r>
         <w:rPr>
@@ -20286,23 +20550,23 @@
           <w:sz w:val="24"/>
           <w:color w:val="000000"/>
         </w:rPr>
-        <w:t>comment.i_hope_this_helps</w:t>
-      </w:r>
-      <w:r>
-        <w:rPr>
-          <w:rFonts w:ascii="Times New Roman" w:hAnsi="Times New Roman" w:cs="Times New Roman" w:eastAsia="Times New Roman"/>
-          <w:b w:val="0"/>
-          <w:i w:val="0"/>
-          <w:sz w:val="28"/>
-          <w:color w:val="000000"/>
-        </w:rPr>
-        <w:t xml:space="preserve"> × 2 — підписи «I hope this helps» і «Let me know if you have any questions» (позиції 220..238 і 244..280);</w:t>
+        <w:t>lst[j+1]</w:t>
+      </w:r>
+      <w:r>
+        <w:rPr>
+          <w:rFonts w:ascii="Times New Roman" w:hAnsi="Times New Roman" w:cs="Times New Roman" w:eastAsia="Times New Roman"/>
+          <w:b w:val="0"/>
+          <w:i w:val="0"/>
+          <w:sz w:val="28"/>
+          <w:color w:val="000000"/>
+        </w:rPr>
+        <w:t>);</w:t>
       </w:r>
     </w:p>
     <w:p>
       <w:pPr>
         <w:spacing w:before="0" w:after="0" w:line="360" w:lineRule="auto"/>
-        <w:ind w:firstLine="720" w:left="0" w:right="0"/>
+        <w:ind w:left="0" w:right="0" w:firstLine="720"/>
         <w:jc w:val="both"/>
       </w:pPr>
       <w:r>
@@ -20313,49 +20577,13 @@
           <w:sz w:val="28"/>
           <w:color w:val="000000"/>
         </w:rPr>
-        <w:t xml:space="preserve">- </w:t>
-      </w:r>
-      <w:r>
-        <w:rPr>
-          <w:rFonts w:ascii="Courier New" w:hAnsi="Courier New" w:cs="Courier New"/>
-          <w:sz w:val="24"/>
-          <w:color w:val="000000"/>
-        </w:rPr>
-        <w:t>markdown.code_fence_in_source</w:t>
-      </w:r>
-      <w:r>
-        <w:rPr>
-          <w:rFonts w:ascii="Times New Roman" w:hAnsi="Times New Roman" w:cs="Times New Roman" w:eastAsia="Times New Roman"/>
-          <w:b w:val="0"/>
-          <w:i w:val="0"/>
-          <w:sz w:val="28"/>
-          <w:color w:val="000000"/>
-        </w:rPr>
-        <w:t xml:space="preserve"> × 2 — потрійні backticks </w:t>
-      </w:r>
-      <w:r>
-        <w:rPr>
-          <w:rFonts w:ascii="Courier New" w:hAnsi="Courier New" w:cs="Courier New"/>
-          <w:sz w:val="24"/>
-          <w:color w:val="000000"/>
-        </w:rPr>
-        <w:t>​</w:t>
-      </w:r>
-      <w:r>
-        <w:rPr>
-          <w:rFonts w:ascii="Times New Roman" w:hAnsi="Times New Roman" w:cs="Times New Roman" w:eastAsia="Times New Roman"/>
-          <w:b w:val="0"/>
-          <w:i w:val="0"/>
-          <w:sz w:val="28"/>
-          <w:color w:val="000000"/>
-        </w:rPr>
-        <w:t>``` (позиції 296..299, 480..483);</w:t>
+        <w:t>— Match with Студент No3 (account4-renamed-copy.py) — Jaccard 0.76, 4 спани (саме той самий код, що в No1, з тими ж токенами);</w:t>
       </w:r>
     </w:p>
     <w:p>
       <w:pPr>
         <w:spacing w:before="0" w:after="0" w:line="360" w:lineRule="auto"/>
-        <w:ind w:firstLine="720" w:left="0" w:right="0"/>
+        <w:ind w:left="0" w:right="0" w:firstLine="720"/>
         <w:jc w:val="both"/>
       </w:pPr>
       <w:r>
@@ -20366,236 +20594,7 @@
           <w:sz w:val="28"/>
           <w:color w:val="000000"/>
         </w:rPr>
-        <w:t xml:space="preserve">- </w:t>
-      </w:r>
-      <w:r>
-        <w:rPr>
-          <w:rFonts w:ascii="Courier New" w:hAnsi="Courier New" w:cs="Courier New"/>
-          <w:sz w:val="24"/>
-          <w:color w:val="000000"/>
-        </w:rPr>
-        <w:t>markdown.language_fence_in_source</w:t>
-      </w:r>
-      <w:r>
-        <w:rPr>
-          <w:rFonts w:ascii="Times New Roman" w:hAnsi="Times New Roman" w:cs="Times New Roman" w:eastAsia="Times New Roman"/>
-          <w:b w:val="0"/>
-          <w:i w:val="0"/>
-          <w:sz w:val="28"/>
-          <w:color w:val="000000"/>
-        </w:rPr>
-        <w:t xml:space="preserve"> — мовний маркер </w:t>
-      </w:r>
-      <w:r>
-        <w:rPr>
-          <w:rFonts w:ascii="Courier New" w:hAnsi="Courier New" w:cs="Courier New"/>
-          <w:sz w:val="24"/>
-          <w:color w:val="000000"/>
-        </w:rPr>
-        <w:t>​</w:t>
-      </w:r>
-      <w:r>
-        <w:rPr>
-          <w:rFonts w:ascii="Times New Roman" w:hAnsi="Times New Roman" w:cs="Times New Roman" w:eastAsia="Times New Roman"/>
-          <w:b w:val="0"/>
-          <w:i w:val="0"/>
-          <w:sz w:val="28"/>
-          <w:color w:val="000000"/>
-        </w:rPr>
-        <w:t>`</w:t>
-      </w:r>
-      <w:r>
-        <w:rPr>
-          <w:rFonts w:ascii="Courier New" w:hAnsi="Courier New" w:cs="Courier New"/>
-          <w:sz w:val="24"/>
-          <w:color w:val="000000"/>
-        </w:rPr>
-        <w:t>python</w:t>
-      </w:r>
-      <w:r>
-        <w:rPr>
-          <w:rFonts w:ascii="Times New Roman" w:hAnsi="Times New Roman" w:cs="Times New Roman" w:eastAsia="Times New Roman"/>
-          <w:b w:val="0"/>
-          <w:i w:val="0"/>
-          <w:sz w:val="28"/>
-          <w:color w:val="000000"/>
-        </w:rPr>
-        <w:t xml:space="preserve"> (позиція 296..305);</w:t>
-      </w:r>
-    </w:p>
-    <w:p>
-      <w:pPr>
-        <w:spacing w:before="0" w:after="0" w:line="360" w:lineRule="auto"/>
-        <w:ind w:firstLine="720" w:left="0" w:right="0"/>
-        <w:jc w:val="both"/>
-      </w:pPr>
-      <w:r>
-        <w:rPr>
-          <w:rFonts w:ascii="Times New Roman" w:hAnsi="Times New Roman" w:cs="Times New Roman" w:eastAsia="Times New Roman"/>
-          <w:b w:val="0"/>
-          <w:i w:val="0"/>
-          <w:sz w:val="28"/>
-          <w:color w:val="000000"/>
-        </w:rPr>
-        <w:t xml:space="preserve">- </w:t>
-      </w:r>
-      <w:r>
-        <w:rPr>
-          <w:rFonts w:ascii="Courier New" w:hAnsi="Courier New" w:cs="Courier New"/>
-          <w:sz w:val="24"/>
-          <w:color w:val="000000"/>
-        </w:rPr>
-        <w:t>boilerplate.example_usage_comment</w:t>
-      </w:r>
-      <w:r>
-        <w:rPr>
-          <w:rFonts w:ascii="Times New Roman" w:hAnsi="Times New Roman" w:cs="Times New Roman" w:eastAsia="Times New Roman"/>
-          <w:b w:val="0"/>
-          <w:i w:val="0"/>
-          <w:sz w:val="28"/>
-          <w:color w:val="000000"/>
-        </w:rPr>
-        <w:t xml:space="preserve"> — секція </w:t>
-      </w:r>
-      <w:r>
-        <w:rPr>
-          <w:rFonts w:ascii="Courier New" w:hAnsi="Courier New" w:cs="Courier New"/>
-          <w:sz w:val="24"/>
-          <w:color w:val="000000"/>
-        </w:rPr>
-        <w:t># Example usage:</w:t>
-      </w:r>
-      <w:r>
-        <w:rPr>
-          <w:rFonts w:ascii="Times New Roman" w:hAnsi="Times New Roman" w:cs="Times New Roman" w:eastAsia="Times New Roman"/>
-          <w:b w:val="0"/>
-          <w:i w:val="0"/>
-          <w:sz w:val="28"/>
-          <w:color w:val="000000"/>
-        </w:rPr>
-        <w:t xml:space="preserve"> (позиція 488..505).</w:t>
-      </w:r>
-    </w:p>
-    <w:p>
-      <w:pPr>
-        <w:spacing w:before="0" w:after="0" w:line="360" w:lineRule="auto"/>
-        <w:ind w:firstLine="720" w:left="0" w:right="0"/>
-        <w:jc w:val="both"/>
-      </w:pPr>
-      <w:r>
-        <w:rPr>
-          <w:rFonts w:ascii="Times New Roman" w:hAnsi="Times New Roman" w:cs="Times New Roman" w:eastAsia="Times New Roman"/>
-          <w:b/>
-          <w:i w:val="0"/>
-          <w:sz w:val="28"/>
-          <w:color w:val="000000"/>
-        </w:rPr>
-        <w:t>Спрацювання сигналу cohort (3 збіги, канал `winnowing`):</w:t>
-      </w:r>
-    </w:p>
-    <w:p>
-      <w:pPr>
-        <w:spacing w:before="0" w:after="0" w:line="360" w:lineRule="auto"/>
-        <w:ind w:firstLine="720" w:left="0" w:right="0"/>
-        <w:jc w:val="both"/>
-      </w:pPr>
-      <w:r>
-        <w:rPr>
-          <w:rFonts w:ascii="Times New Roman" w:hAnsi="Times New Roman" w:cs="Times New Roman" w:eastAsia="Times New Roman"/>
-          <w:b w:val="0"/>
-          <w:i w:val="0"/>
-          <w:sz w:val="28"/>
-          <w:color w:val="000000"/>
-        </w:rPr>
-        <w:t xml:space="preserve">- Match with Студент No2 (account2-web-copy.py) — Jaccard 0.76, 4 спани (спільний кістяк </w:t>
-      </w:r>
-      <w:r>
-        <w:rPr>
-          <w:rFonts w:ascii="Courier New" w:hAnsi="Courier New" w:cs="Courier New"/>
-          <w:sz w:val="24"/>
-          <w:color w:val="000000"/>
-        </w:rPr>
-        <w:t>for j in range</w:t>
-      </w:r>
-      <w:r>
-        <w:rPr>
-          <w:rFonts w:ascii="Times New Roman" w:hAnsi="Times New Roman" w:cs="Times New Roman" w:eastAsia="Times New Roman"/>
-          <w:b w:val="0"/>
-          <w:i w:val="0"/>
-          <w:sz w:val="28"/>
-          <w:color w:val="000000"/>
-        </w:rPr>
-        <w:t xml:space="preserve">, </w:t>
-      </w:r>
-      <w:r>
-        <w:rPr>
-          <w:rFonts w:ascii="Courier New" w:hAnsi="Courier New" w:cs="Courier New"/>
-          <w:sz w:val="24"/>
-          <w:color w:val="000000"/>
-        </w:rPr>
-        <w:t>lst[j]</w:t>
-      </w:r>
-      <w:r>
-        <w:rPr>
-          <w:rFonts w:ascii="Times New Roman" w:hAnsi="Times New Roman" w:cs="Times New Roman" w:eastAsia="Times New Roman"/>
-          <w:b w:val="0"/>
-          <w:i w:val="0"/>
-          <w:sz w:val="28"/>
-          <w:color w:val="000000"/>
-        </w:rPr>
-        <w:t xml:space="preserve">, </w:t>
-      </w:r>
-      <w:r>
-        <w:rPr>
-          <w:rFonts w:ascii="Courier New" w:hAnsi="Courier New" w:cs="Courier New"/>
-          <w:sz w:val="24"/>
-          <w:color w:val="000000"/>
-        </w:rPr>
-        <w:t>lst[j+1]</w:t>
-      </w:r>
-      <w:r>
-        <w:rPr>
-          <w:rFonts w:ascii="Times New Roman" w:hAnsi="Times New Roman" w:cs="Times New Roman" w:eastAsia="Times New Roman"/>
-          <w:b w:val="0"/>
-          <w:i w:val="0"/>
-          <w:sz w:val="28"/>
-          <w:color w:val="000000"/>
-        </w:rPr>
-        <w:t>);</w:t>
-      </w:r>
-    </w:p>
-    <w:p>
-      <w:pPr>
-        <w:spacing w:before="0" w:after="0" w:line="360" w:lineRule="auto"/>
-        <w:ind w:firstLine="720" w:left="0" w:right="0"/>
-        <w:jc w:val="both"/>
-      </w:pPr>
-      <w:r>
-        <w:rPr>
-          <w:rFonts w:ascii="Times New Roman" w:hAnsi="Times New Roman" w:cs="Times New Roman" w:eastAsia="Times New Roman"/>
-          <w:b w:val="0"/>
-          <w:i w:val="0"/>
-          <w:sz w:val="28"/>
-          <w:color w:val="000000"/>
-        </w:rPr>
-        <w:t>- Match with Студент No3 (account4-renamed-copy.py) — Jaccard 0.76, 4 спани (саме той самий код, що в No1, з тими ж токенами);</w:t>
-      </w:r>
-    </w:p>
-    <w:p>
-      <w:pPr>
-        <w:spacing w:before="0" w:after="0" w:line="360" w:lineRule="auto"/>
-        <w:ind w:firstLine="720" w:left="0" w:right="0"/>
-        <w:jc w:val="both"/>
-      </w:pPr>
-      <w:r>
-        <w:rPr>
-          <w:rFonts w:ascii="Times New Roman" w:hAnsi="Times New Roman" w:cs="Times New Roman" w:eastAsia="Times New Roman"/>
-          <w:b w:val="0"/>
-          <w:i w:val="0"/>
-          <w:sz w:val="28"/>
-          <w:color w:val="000000"/>
-        </w:rPr>
-        <w:t xml:space="preserve">- Match with Студент No4 (account2-web-copy.py) — Jaccard 0.45, 4 спани (часткове перетворення з перейменуванням </w:t>
+        <w:t xml:space="preserve">— Match with Студент No4 (account2-web-copy.py) — Jaccard 0.45, 4 спани (часткове перетворення з перейменуванням </w:t>
       </w:r>
       <w:r>
         <w:rPr>
@@ -20832,10 +20831,9 @@
     </w:p>
     <w:p>
       <w:pPr>
-        <w:pStyle w:val="1"/>
-        <w:pageBreakBefore/>
         <w:ind w:firstLine="0"/>
         <w:jc w:val="center"/>
+        <w:spacing w:after="360" w:line="360" w:lineRule="auto"/>
       </w:pPr>
       <w:r>
         <w:rPr>
@@ -20845,7 +20843,7 @@
           <w:sz w:val="28"/>
           <w:color w:val="000000"/>
         </w:rPr>
-        <w:t>ПОВНИЙ ПЕРЕЛІК ПРАВИЛ ТАКСОНОМІЇ</w:t>
+        <w:t>Повний перелік правил таксономії</w:t>
       </w:r>
     </w:p>
     <w:p>
@@ -22574,10 +22572,9 @@
     </w:p>
     <w:p>
       <w:pPr>
-        <w:pStyle w:val="1"/>
-        <w:pageBreakBefore/>
         <w:ind w:firstLine="0"/>
         <w:jc w:val="center"/>
+        <w:spacing w:after="360" w:line="360" w:lineRule="auto"/>
       </w:pPr>
       <w:r>
         <w:rPr>
@@ -22587,7 +22584,7 @@
           <w:sz w:val="28"/>
           <w:color w:val="000000"/>
         </w:rPr>
-        <w:t>КОНФІГУРАЦІЯ ЗАПУСКУ ОЦІНЮВАЛЬНОГО СТЕНДУ</w:t>
+        <w:t>Конфігурація запуску оцінювального стенду</w:t>
       </w:r>
     </w:p>
     <w:p>

</xml_diff>

<commit_message>
Methodics §3.2 heading spacing — 2 intervals to text, 1 between headings
Previous build used 24pt after Heading 1 and 18pt around Heading 2,
both below the «не менше двох міжрядкових інтервалів» rule
(42pt = 2 × 21pt with TNR 14 at 1.5 line spacing).

- HEADING_GAP_TWIPS = "840" (42pt) constant for all heading↔body gaps.
- add_top_level_heading: space_after = 42pt by default; caller can
  override with "0" when an appendix title follows immediately, so
  the «ДОДАТОК Х» → title gap is just one body line interval (§3.2
  «між двома заголовками — півтора інтервали»).
- add_subsection_heading: space_before = space_after = 42pt.
- add_appendix_title: space_after = 42pt before appendix body.
- _set_spacing helper centralizes <w:spacing> manipulation across the
  three heading variants.

Verified: 17 Heading 1 paragraphs at 42pt after; 29 Heading 2 at
42pt before and after; appendix title pairs at 0pt + 42pt as
methodics requires.
</commit_message>
<xml_diff>
--- a/thesis/diploma.docx
+++ b/thesis/diploma.docx
@@ -494,6 +494,7 @@
         <w:pageBreakBefore/>
         <w:ind w:firstLine="0"/>
         <w:jc w:val="center"/>
+        <w:spacing w:before="0" w:after="840" w:line="360" w:lineRule="auto"/>
       </w:pPr>
       <w:r>
         <w:rPr>
@@ -732,6 +733,7 @@
         <w:pageBreakBefore/>
         <w:ind w:firstLine="0"/>
         <w:jc w:val="center"/>
+        <w:spacing w:before="0" w:after="840" w:line="360" w:lineRule="auto"/>
       </w:pPr>
       <w:r>
         <w:rPr>
@@ -771,6 +773,7 @@
         <w:pageBreakBefore/>
         <w:ind w:firstLine="0"/>
         <w:jc w:val="center"/>
+        <w:spacing w:before="0" w:after="840" w:line="360" w:lineRule="auto"/>
       </w:pPr>
       <w:r>
         <w:rPr>
@@ -1078,6 +1081,7 @@
         <w:pageBreakBefore/>
         <w:ind w:firstLine="0"/>
         <w:jc w:val="center"/>
+        <w:spacing w:before="0" w:after="840" w:line="360" w:lineRule="auto"/>
       </w:pPr>
       <w:r>
         <w:rPr>
@@ -1468,6 +1472,7 @@
         <w:pageBreakBefore/>
         <w:ind w:firstLine="0"/>
         <w:jc w:val="center"/>
+        <w:spacing w:before="0" w:after="840" w:line="360" w:lineRule="auto"/>
       </w:pPr>
       <w:r>
         <w:rPr>
@@ -1485,6 +1490,7 @@
         <w:pStyle w:val="21"/>
         <w:ind w:firstLine="720"/>
         <w:jc w:val="left"/>
+        <w:spacing w:before="840" w:after="840" w:line="360" w:lineRule="auto"/>
       </w:pPr>
       <w:r>
         <w:rPr>
@@ -1553,6 +1559,7 @@
         <w:pStyle w:val="21"/>
         <w:ind w:firstLine="720"/>
         <w:jc w:val="left"/>
+        <w:spacing w:before="840" w:after="840" w:line="360" w:lineRule="auto"/>
       </w:pPr>
       <w:r>
         <w:rPr>
@@ -1587,6 +1594,7 @@
         <w:pStyle w:val="21"/>
         <w:ind w:firstLine="720"/>
         <w:jc w:val="left"/>
+        <w:spacing w:before="840" w:after="840" w:line="360" w:lineRule="auto"/>
       </w:pPr>
       <w:r>
         <w:rPr>
@@ -1638,6 +1646,7 @@
         <w:pStyle w:val="21"/>
         <w:ind w:firstLine="720"/>
         <w:jc w:val="left"/>
+        <w:spacing w:before="840" w:after="840" w:line="360" w:lineRule="auto"/>
       </w:pPr>
       <w:r>
         <w:rPr>
@@ -1672,6 +1681,7 @@
         <w:pStyle w:val="21"/>
         <w:ind w:firstLine="720"/>
         <w:jc w:val="left"/>
+        <w:spacing w:before="840" w:after="840" w:line="360" w:lineRule="auto"/>
       </w:pPr>
       <w:r>
         <w:rPr>
@@ -1871,6 +1881,7 @@
         <w:pStyle w:val="21"/>
         <w:ind w:firstLine="720"/>
         <w:jc w:val="left"/>
+        <w:spacing w:before="840" w:after="840" w:line="360" w:lineRule="auto"/>
       </w:pPr>
       <w:r>
         <w:rPr>
@@ -1925,6 +1936,7 @@
         <w:pStyle w:val="21"/>
         <w:ind w:firstLine="720"/>
         <w:jc w:val="left"/>
+        <w:spacing w:before="840" w:after="840" w:line="360" w:lineRule="auto"/>
       </w:pPr>
       <w:r>
         <w:rPr>
@@ -2010,6 +2022,7 @@
         <w:pStyle w:val="21"/>
         <w:ind w:firstLine="720"/>
         <w:jc w:val="left"/>
+        <w:spacing w:before="840" w:after="840" w:line="360" w:lineRule="auto"/>
       </w:pPr>
       <w:r>
         <w:rPr>
@@ -2095,6 +2108,7 @@
         <w:pStyle w:val="21"/>
         <w:ind w:firstLine="720"/>
         <w:jc w:val="left"/>
+        <w:spacing w:before="840" w:after="840" w:line="360" w:lineRule="auto"/>
       </w:pPr>
       <w:r>
         <w:rPr>
@@ -2349,6 +2363,7 @@
         <w:pageBreakBefore/>
         <w:ind w:firstLine="0"/>
         <w:jc w:val="center"/>
+        <w:spacing w:before="0" w:after="840" w:line="360" w:lineRule="auto"/>
       </w:pPr>
       <w:r>
         <w:rPr>
@@ -2366,6 +2381,7 @@
         <w:pStyle w:val="21"/>
         <w:ind w:firstLine="720"/>
         <w:jc w:val="left"/>
+        <w:spacing w:before="840" w:after="840" w:line="360" w:lineRule="auto"/>
       </w:pPr>
       <w:r>
         <w:rPr>
@@ -2757,6 +2773,7 @@
         <w:pStyle w:val="21"/>
         <w:ind w:firstLine="720"/>
         <w:jc w:val="left"/>
+        <w:spacing w:before="840" w:after="840" w:line="360" w:lineRule="auto"/>
       </w:pPr>
       <w:r>
         <w:rPr>
@@ -3173,6 +3190,7 @@
         <w:pStyle w:val="21"/>
         <w:ind w:firstLine="720"/>
         <w:jc w:val="left"/>
+        <w:spacing w:before="840" w:after="840" w:line="360" w:lineRule="auto"/>
       </w:pPr>
       <w:r>
         <w:rPr>
@@ -3961,6 +3979,7 @@
         <w:pStyle w:val="21"/>
         <w:ind w:firstLine="720"/>
         <w:jc w:val="left"/>
+        <w:spacing w:before="840" w:after="840" w:line="360" w:lineRule="auto"/>
       </w:pPr>
       <w:r>
         <w:rPr>
@@ -4081,6 +4100,7 @@
         <w:pageBreakBefore/>
         <w:ind w:firstLine="0"/>
         <w:jc w:val="center"/>
+        <w:spacing w:before="0" w:after="840" w:line="360" w:lineRule="auto"/>
       </w:pPr>
       <w:r>
         <w:rPr>
@@ -4303,6 +4323,7 @@
         <w:pStyle w:val="21"/>
         <w:ind w:firstLine="720"/>
         <w:jc w:val="left"/>
+        <w:spacing w:before="840" w:after="840" w:line="360" w:lineRule="auto"/>
       </w:pPr>
       <w:r>
         <w:rPr>
@@ -4702,6 +4723,7 @@
         <w:pStyle w:val="21"/>
         <w:ind w:firstLine="720"/>
         <w:jc w:val="left"/>
+        <w:spacing w:before="840" w:after="840" w:line="360" w:lineRule="auto"/>
       </w:pPr>
       <w:r>
         <w:rPr>
@@ -6017,6 +6039,7 @@
         <w:pStyle w:val="21"/>
         <w:ind w:firstLine="720"/>
         <w:jc w:val="left"/>
+        <w:spacing w:before="840" w:after="840" w:line="360" w:lineRule="auto"/>
       </w:pPr>
       <w:r>
         <w:rPr>
@@ -6747,6 +6770,7 @@
         <w:pStyle w:val="21"/>
         <w:ind w:firstLine="720"/>
         <w:jc w:val="left"/>
+        <w:spacing w:before="840" w:after="840" w:line="360" w:lineRule="auto"/>
       </w:pPr>
       <w:r>
         <w:rPr>
@@ -7006,6 +7030,7 @@
         <w:pStyle w:val="21"/>
         <w:ind w:firstLine="720"/>
         <w:jc w:val="left"/>
+        <w:spacing w:before="840" w:after="840" w:line="360" w:lineRule="auto"/>
       </w:pPr>
       <w:r>
         <w:rPr>
@@ -7388,6 +7413,7 @@
         <w:pStyle w:val="21"/>
         <w:ind w:firstLine="720"/>
         <w:jc w:val="left"/>
+        <w:spacing w:before="840" w:after="840" w:line="360" w:lineRule="auto"/>
       </w:pPr>
       <w:r>
         <w:rPr>
@@ -8393,6 +8419,7 @@
         <w:pageBreakBefore/>
         <w:ind w:firstLine="0"/>
         <w:jc w:val="center"/>
+        <w:spacing w:before="0" w:after="840" w:line="360" w:lineRule="auto"/>
       </w:pPr>
       <w:r>
         <w:rPr>
@@ -8410,6 +8437,7 @@
         <w:pStyle w:val="21"/>
         <w:ind w:firstLine="720"/>
         <w:jc w:val="left"/>
+        <w:spacing w:before="840" w:after="840" w:line="360" w:lineRule="auto"/>
       </w:pPr>
       <w:r>
         <w:rPr>
@@ -8609,6 +8637,7 @@
         <w:pStyle w:val="21"/>
         <w:ind w:firstLine="720"/>
         <w:jc w:val="left"/>
+        <w:spacing w:before="840" w:after="840" w:line="360" w:lineRule="auto"/>
       </w:pPr>
       <w:r>
         <w:rPr>
@@ -9894,6 +9923,7 @@
         <w:pStyle w:val="21"/>
         <w:ind w:firstLine="720"/>
         <w:jc w:val="left"/>
+        <w:spacing w:before="840" w:after="840" w:line="360" w:lineRule="auto"/>
       </w:pPr>
       <w:r>
         <w:rPr>
@@ -10444,6 +10474,7 @@
         <w:pStyle w:val="21"/>
         <w:ind w:firstLine="720"/>
         <w:jc w:val="left"/>
+        <w:spacing w:before="840" w:after="840" w:line="360" w:lineRule="auto"/>
       </w:pPr>
       <w:r>
         <w:rPr>
@@ -10691,6 +10722,7 @@
         <w:pStyle w:val="21"/>
         <w:ind w:firstLine="720"/>
         <w:jc w:val="left"/>
+        <w:spacing w:before="840" w:after="840" w:line="360" w:lineRule="auto"/>
       </w:pPr>
       <w:r>
         <w:rPr>
@@ -15023,6 +15055,7 @@
         <w:pageBreakBefore/>
         <w:ind w:firstLine="0"/>
         <w:jc w:val="center"/>
+        <w:spacing w:before="0" w:after="840" w:line="360" w:lineRule="auto"/>
       </w:pPr>
       <w:r>
         <w:rPr>
@@ -15040,6 +15073,7 @@
         <w:pStyle w:val="21"/>
         <w:ind w:firstLine="720"/>
         <w:jc w:val="left"/>
+        <w:spacing w:before="840" w:after="840" w:line="360" w:lineRule="auto"/>
       </w:pPr>
       <w:r>
         <w:rPr>
@@ -15211,6 +15245,7 @@
         <w:pStyle w:val="21"/>
         <w:ind w:firstLine="720"/>
         <w:jc w:val="left"/>
+        <w:spacing w:before="840" w:after="840" w:line="360" w:lineRule="auto"/>
       </w:pPr>
       <w:r>
         <w:rPr>
@@ -16493,6 +16528,7 @@
         <w:pStyle w:val="21"/>
         <w:ind w:firstLine="720"/>
         <w:jc w:val="left"/>
+        <w:spacing w:before="840" w:after="840" w:line="360" w:lineRule="auto"/>
       </w:pPr>
       <w:r>
         <w:rPr>
@@ -16825,6 +16861,7 @@
         <w:pStyle w:val="21"/>
         <w:ind w:firstLine="720"/>
         <w:jc w:val="left"/>
+        <w:spacing w:before="840" w:after="840" w:line="360" w:lineRule="auto"/>
       </w:pPr>
       <w:r>
         <w:rPr>
@@ -18694,6 +18731,7 @@
         <w:pStyle w:val="21"/>
         <w:ind w:firstLine="720"/>
         <w:jc w:val="left"/>
+        <w:spacing w:before="840" w:after="840" w:line="360" w:lineRule="auto"/>
       </w:pPr>
       <w:r>
         <w:rPr>
@@ -19139,6 +19177,7 @@
         <w:pageBreakBefore/>
         <w:ind w:firstLine="0"/>
         <w:jc w:val="center"/>
+        <w:spacing w:before="0" w:after="840" w:line="360" w:lineRule="auto"/>
       </w:pPr>
       <w:r>
         <w:rPr>
@@ -19602,6 +19641,7 @@
         <w:pageBreakBefore/>
         <w:ind w:firstLine="0"/>
         <w:jc w:val="center"/>
+        <w:spacing w:before="0" w:after="840" w:line="360" w:lineRule="auto"/>
       </w:pPr>
       <w:r>
         <w:rPr>
@@ -20419,6 +20459,7 @@
         <w:pageBreakBefore/>
         <w:ind w:firstLine="0"/>
         <w:jc w:val="center"/>
+        <w:spacing w:before="0" w:after="0" w:line="360" w:lineRule="auto"/>
       </w:pPr>
       <w:r>
         <w:rPr>
@@ -20435,7 +20476,7 @@
       <w:pPr>
         <w:ind w:firstLine="0"/>
         <w:jc w:val="center"/>
-        <w:spacing w:after="360" w:line="360" w:lineRule="auto"/>
+        <w:spacing w:before="0" w:after="840" w:line="360" w:lineRule="auto"/>
       </w:pPr>
       <w:r>
         <w:rPr>
@@ -21257,6 +21298,7 @@
         <w:pageBreakBefore/>
         <w:ind w:firstLine="0"/>
         <w:jc w:val="center"/>
+        <w:spacing w:before="0" w:after="0" w:line="360" w:lineRule="auto"/>
       </w:pPr>
       <w:r>
         <w:rPr>
@@ -21273,7 +21315,7 @@
       <w:pPr>
         <w:ind w:firstLine="0"/>
         <w:jc w:val="center"/>
-        <w:spacing w:after="360" w:line="360" w:lineRule="auto"/>
+        <w:spacing w:before="0" w:after="840" w:line="360" w:lineRule="auto"/>
       </w:pPr>
       <w:r>
         <w:rPr>
@@ -23002,6 +23044,7 @@
         <w:pageBreakBefore/>
         <w:ind w:firstLine="0"/>
         <w:jc w:val="center"/>
+        <w:spacing w:before="0" w:after="0" w:line="360" w:lineRule="auto"/>
       </w:pPr>
       <w:r>
         <w:rPr>
@@ -23018,7 +23061,7 @@
       <w:pPr>
         <w:ind w:firstLine="0"/>
         <w:jc w:val="center"/>
-        <w:spacing w:after="360" w:line="360" w:lineRule="auto"/>
+        <w:spacing w:before="0" w:after="840" w:line="360" w:lineRule="auto"/>
       </w:pPr>
       <w:r>
         <w:rPr>

</xml_diff>

<commit_message>
Fix referat — match methodics §2.2 + Annex Б example
1. Object line still said «у письмових сабмішнах» — leftover from
   the original prose-system framing. After the code-system pivot
   the referat object claimed something the rest of the work does
   not deliver. Replaced with «у сабмішнах вихідного коду, поданих
   студентами через Google Classroom», matching the predmet line
   and the rest of the thesis.

2. Volume line formatting. Annex Б example (page 44) reads
   «Обсяг роботи 57 сторінок, 12 ілюстрацій…» — no «—» between
   «роботи» and the number. Dropped the dash.

3. Keywords were not in alphabetical order. §2.2 explicitly
   requires «їх записують за абеткою мови роботи великими
   літерами в рядок із прямим порядком слів». Reordered:
   Ukrainian keywords alphabetically first (АКАДЕМІЧНА
   ДОБРОЧЕСНІСТЬ → … → РАНЖУВАННЯ), then Latin (GOOGLE
   CLASSROOM, WINNOWING).
</commit_message>
<xml_diff>
--- a/thesis/diploma.docx
+++ b/thesis/diploma.docx
@@ -521,31 +521,7 @@
           <w:sz w:val="28"/>
           <w:color w:val="000000"/>
         </w:rPr>
-        <w:t xml:space="preserve">Обсяг роботи — </w:t>
-      </w:r>
-      <w:r>
-        <w:rPr>
-          <w:rFonts w:ascii="Times New Roman" w:hAnsi="Times New Roman" w:cs="Times New Roman" w:eastAsia="Times New Roman"/>
-          <w:b w:val="0"/>
-          <w:i w:val="0"/>
-          <w:sz w:val="28"/>
-          <w:color w:val="000000"/>
-        </w:rPr>
-        <w:fldChar w:fldCharType="begin" w:dirty="true"/>
-        <w:instrText xml:space="preserve"> NUMPAGES \* MERGEFORMAT </w:instrText>
-        <w:fldChar w:fldCharType="separate"/>
-        <w:t xml:space="preserve">56</w:t>
-        <w:fldChar w:fldCharType="end"/>
-      </w:r>
-      <w:r>
-        <w:rPr>
-          <w:rFonts w:ascii="Times New Roman" w:hAnsi="Times New Roman" w:cs="Times New Roman" w:eastAsia="Times New Roman"/>
-          <w:b w:val="0"/>
-          <w:i w:val="0"/>
-          <w:sz w:val="28"/>
-          <w:color w:val="000000"/>
-        </w:rPr>
-        <w:t xml:space="preserve"> сторінок, 6 ілюстрацій, 4 таблиці, 26 джерел посилань, 3 додатки.</w:t>
+        <w:t>Обсяг роботи 56 сторінок, 6 ілюстрацій, 4 таблиці, 26 джерел посилань, 3 додатки.</w:t>
       </w:r>
     </w:p>
     <w:p>
@@ -562,7 +538,7 @@
           <w:sz w:val="28"/>
           <w:color w:val="000000"/>
         </w:rPr>
-        <w:t>ВИЯВЛЕННЯ ПЛАГІАТУ В КОДІ, АКАДЕМІЧНА ДОБРОЧЕСНІСТЬ, GOOGLE CLASSROOM, WINNOWING, АНАЛІЗ СИНТАКСИЧНОГО ДЕРЕВА, ВЕЛИКА МОВНА МОДЕЛЬ, ПРАВИЛОВА ТАКСОНОМІЯ, ПОЯСНЮВАНІСТЬ, РАНЖУВАННЯ, ОЦІНЮВАННЯ.</w:t>
+        <w:t>АКАДЕМІЧНА ДОБРОЧЕСНІСТЬ, АНАЛІЗ СИНТАКСИЧНОГО ДЕРЕВА, ВЕЛИКА МОВНА МОДЕЛЬ, ВИЯВЛЕННЯ ПЛАГІАТУ В КОДІ, ОЦІНЮВАННЯ, ПОЯСНЮВАНІСТЬ, ПРАВИЛОВА ТАКСОНОМІЯ, РАНЖУВАННЯ, GOOGLE CLASSROOM, WINNOWING.</w:t>
       </w:r>
     </w:p>
     <w:p>
@@ -579,7 +555,7 @@
           <w:sz w:val="28"/>
           <w:color w:val="000000"/>
         </w:rPr>
-        <w:t>Об'єктом дослідження є процес перевірки на ознаки плагіату й недбалого використання великих мовних моделей у письмових сабмішнах студентів, поданих у середовищі Google Classroom у межах курсів із програмування.</w:t>
+        <w:t>Об'єктом дослідження є процес перевірки на ознаки плагіату й недбалого використання великих мовних моделей у сабмішнах вихідного коду, поданих студентами через Google Classroom у межах курсів із програмування.</w:t>
       </w:r>
     </w:p>
     <w:p>

</xml_diff>